<commit_message>
feat(analysis): offline parser ablation and final report gaps
- scripts/parser_ablation.py replays the three hybrid k=1 1K runs under
  five parser variants with no new LLM calls; the full parser reproduces
  100% of logged first attempts, 32 new rule candidates verified on Lean.
  Parser lifts label agreement 72.3% -> 96.3% and cuts tokens 31%, but
  hybrid k=1 success drops 34.9% -> 30.3% because better labels route more
  samples to low-precision rules R1-R6 (report table 9).
- report: table 9 + paragraph, R5 rename-table leakage note in threats to
  validity, related work trimmed to 8 references; rebuilt at 20 pages
- contributions.md: GitHub PR list #1-#9 and open review tasks
- README: Group 5 gateway section and ablation command
- .dockerignore: keep lean_ws/.lake (7.3 GB), data/ and .venv out of context

Co-Authored-By: Claude Opus 5.5 <noreply@anthropic.com>
</commit_message>
<xml_diff>
--- a/reports/report.docx
+++ b/reports/report.docx
@@ -1718,7 +1718,7 @@
         <w:jc w:val="both"/>
       </w:pPr>
       <w:r>
-        <w:t>Baldur [5] sinh toàn bộ chứng minh và sửa bằng cách đưa thông báo lỗi vào mô hình trên Isabelle/HOL, gần nhất với RQ1. Self-Debugging [6] cho thấy LLM tự sửa mã tốt hơn khi có phản hồi thực thi. DeepSeek-Prover-V1.5 [7] dùng phản hồi của Lean cho học tăng cường và tìm kiếm cây, DeepSeek-Prover-V2 [8] phân rã mục tiêu con, Draft-Sketch-Prove [9] dùng bản nháp phi hình thức để dẫn hướng.</w:t>
+        <w:t>Baldur [5] sinh toàn bộ chứng minh và sửa bằng cách đưa thông báo lỗi vào mô hình trên Isabelle/HOL, gần nhất với RQ1. Self-Debugging [6] cho thấy LLM tự sửa mã tốt hơn khi có phản hồi thực thi. DeepSeek-Prover-V1.5 [7] dùng phản hồi của Lean cho học tăng cường và tìm kiếm cây.</w:t>
       </w:r>
     </w:p>
     <w:p>
@@ -1735,7 +1735,7 @@
         <w:jc w:val="both"/>
       </w:pPr>
       <w:r>
-        <w:t>Các công trình trên tối ưu chất lượng mô hình nhưng ít báo cáo đồng thời chi phí token, độ trễ đuôi và khả năng mở rộng của hệ thống kiểm chứng, là phần chiếm phần lớn thời gian thực tế. Nhóm coi verifier là tài nguyên khan hiếm cần lập lịch, theo tinh thần xử lý theo lô trong [10].</w:t>
+        <w:t>Các công trình trên tối ưu chất lượng mô hình nhưng ít báo cáo đồng thời chi phí token, độ trễ đuôi và khả năng mở rộng của hệ thống kiểm chứng, là phần chiếm phần lớn thời gian thực tế. Nhóm coi verifier là tài nguyên khan hiếm cần lập lịch, theo tinh thần xử lý theo lô trong [8].</w:t>
       </w:r>
     </w:p>
     <w:p>
@@ -6697,6 +6697,570 @@
     </w:p>
     <w:p>
       <w:pPr>
+        <w:pStyle w:val="Caption"/>
+        <w:keepNext/>
+      </w:pPr>
+      <w:r>
+        <w:t>Bảng 7.3: Ablation bộ phân loại, phát lại lai k=1 trên hold-out 1K; ba lần lặp cho cùng kết quả nhờ bộ đệm.</w:t>
+      </w:r>
+    </w:p>
+    <w:tbl>
+      <w:tblPr>
+        <w:tblStyle w:val="TableGrid"/>
+        <w:tblW w:type="auto" w:w="0"/>
+        <w:jc w:val="center"/>
+        <w:tblLook w:firstColumn="1" w:firstRow="1" w:lastColumn="0" w:lastRow="0" w:noHBand="0" w:noVBand="1" w:val="04A0"/>
+      </w:tblPr>
+      <w:tblGrid>
+        <w:gridCol w:w="1701"/>
+        <w:gridCol w:w="1701"/>
+        <w:gridCol w:w="1701"/>
+        <w:gridCol w:w="1701"/>
+        <w:gridCol w:w="1701"/>
+      </w:tblGrid>
+      <w:tr>
+        <w:tc>
+          <w:tcPr>
+            <w:tcW w:type="dxa" w:w="1701"/>
+            <w:shd w:val="clear" w:color="auto" w:fill="E8EEF6"/>
+          </w:tcPr>
+          <w:p>
+            <w:pPr>
+              <w:keepNext/>
+              <w:spacing w:after="0" w:line="240" w:lineRule="auto"/>
+            </w:pPr>
+            <w:r>
+              <w:rPr>
+                <w:b/>
+                <w:sz w:val="24"/>
+              </w:rPr>
+              <w:t>Bộ phân loại</w:t>
+            </w:r>
+          </w:p>
+        </w:tc>
+        <w:tc>
+          <w:tcPr>
+            <w:tcW w:type="dxa" w:w="1701"/>
+            <w:shd w:val="clear" w:color="auto" w:fill="E8EEF6"/>
+          </w:tcPr>
+          <w:p>
+            <w:pPr>
+              <w:keepNext/>
+              <w:spacing w:after="0" w:line="240" w:lineRule="auto"/>
+            </w:pPr>
+            <w:r>
+              <w:rPr>
+                <w:b/>
+                <w:sz w:val="24"/>
+              </w:rPr>
+              <w:t>Khớp nhãn</w:t>
+            </w:r>
+          </w:p>
+        </w:tc>
+        <w:tc>
+          <w:tcPr>
+            <w:tcW w:type="dxa" w:w="1701"/>
+            <w:shd w:val="clear" w:color="auto" w:fill="E8EEF6"/>
+          </w:tcPr>
+          <w:p>
+            <w:pPr>
+              <w:keepNext/>
+              <w:spacing w:after="0" w:line="240" w:lineRule="auto"/>
+            </w:pPr>
+            <w:r>
+              <w:rPr>
+                <w:b/>
+                <w:sz w:val="24"/>
+              </w:rPr>
+              <w:t>Sang luật</w:t>
+            </w:r>
+          </w:p>
+        </w:tc>
+        <w:tc>
+          <w:tcPr>
+            <w:tcW w:type="dxa" w:w="1701"/>
+            <w:shd w:val="clear" w:color="auto" w:fill="E8EEF6"/>
+          </w:tcPr>
+          <w:p>
+            <w:pPr>
+              <w:keepNext/>
+              <w:spacing w:after="0" w:line="240" w:lineRule="auto"/>
+            </w:pPr>
+            <w:r>
+              <w:rPr>
+                <w:b/>
+                <w:sz w:val="24"/>
+              </w:rPr>
+              <w:t>Thành công lai k=1</w:t>
+            </w:r>
+          </w:p>
+        </w:tc>
+        <w:tc>
+          <w:tcPr>
+            <w:tcW w:type="dxa" w:w="1701"/>
+            <w:shd w:val="clear" w:color="auto" w:fill="E8EEF6"/>
+          </w:tcPr>
+          <w:p>
+            <w:pPr>
+              <w:keepNext/>
+              <w:spacing w:after="0" w:line="240" w:lineRule="auto"/>
+            </w:pPr>
+            <w:r>
+              <w:rPr>
+                <w:b/>
+                <w:sz w:val="24"/>
+              </w:rPr>
+              <w:t>Token/mẫu</w:t>
+            </w:r>
+          </w:p>
+        </w:tc>
+      </w:tr>
+      <w:tr>
+        <w:tc>
+          <w:tcPr>
+            <w:tcW w:type="dxa" w:w="1701"/>
+          </w:tcPr>
+          <w:p>
+            <w:pPr>
+              <w:keepNext/>
+              <w:spacing w:after="0" w:line="240" w:lineRule="auto"/>
+            </w:pPr>
+            <w:r>
+              <w:rPr>
+                <w:sz w:val="24"/>
+              </w:rPr>
+              <w:t>Đầy đủ v0.2</w:t>
+            </w:r>
+          </w:p>
+        </w:tc>
+        <w:tc>
+          <w:tcPr>
+            <w:tcW w:type="dxa" w:w="1701"/>
+          </w:tcPr>
+          <w:p>
+            <w:pPr>
+              <w:keepNext/>
+              <w:spacing w:after="0" w:line="240" w:lineRule="auto"/>
+            </w:pPr>
+            <w:r>
+              <w:rPr>
+                <w:sz w:val="24"/>
+              </w:rPr>
+              <w:t>96,3%</w:t>
+            </w:r>
+          </w:p>
+        </w:tc>
+        <w:tc>
+          <w:tcPr>
+            <w:tcW w:type="dxa" w:w="1701"/>
+          </w:tcPr>
+          <w:p>
+            <w:pPr>
+              <w:keepNext/>
+              <w:spacing w:after="0" w:line="240" w:lineRule="auto"/>
+            </w:pPr>
+            <w:r>
+              <w:rPr>
+                <w:sz w:val="24"/>
+              </w:rPr>
+              <w:t>71,5%</w:t>
+            </w:r>
+          </w:p>
+        </w:tc>
+        <w:tc>
+          <w:tcPr>
+            <w:tcW w:type="dxa" w:w="1701"/>
+          </w:tcPr>
+          <w:p>
+            <w:pPr>
+              <w:keepNext/>
+              <w:spacing w:after="0" w:line="240" w:lineRule="auto"/>
+            </w:pPr>
+            <w:r>
+              <w:rPr>
+                <w:sz w:val="24"/>
+              </w:rPr>
+              <w:t>30,3%</w:t>
+            </w:r>
+          </w:p>
+        </w:tc>
+        <w:tc>
+          <w:tcPr>
+            <w:tcW w:type="dxa" w:w="1701"/>
+          </w:tcPr>
+          <w:p>
+            <w:pPr>
+              <w:keepNext/>
+              <w:spacing w:after="0" w:line="240" w:lineRule="auto"/>
+            </w:pPr>
+            <w:r>
+              <w:rPr>
+                <w:sz w:val="24"/>
+              </w:rPr>
+              <w:t>316</w:t>
+            </w:r>
+          </w:p>
+        </w:tc>
+      </w:tr>
+      <w:tr>
+        <w:tc>
+          <w:tcPr>
+            <w:tcW w:type="dxa" w:w="1701"/>
+          </w:tcPr>
+          <w:p>
+            <w:pPr>
+              <w:keepNext/>
+              <w:spacing w:after="0" w:line="240" w:lineRule="auto"/>
+            </w:pPr>
+            <w:r>
+              <w:rPr>
+                <w:sz w:val="24"/>
+              </w:rPr>
+              <w:t>Bỏ lọc lỗi hệ quả</w:t>
+            </w:r>
+          </w:p>
+        </w:tc>
+        <w:tc>
+          <w:tcPr>
+            <w:tcW w:type="dxa" w:w="1701"/>
+          </w:tcPr>
+          <w:p>
+            <w:pPr>
+              <w:keepNext/>
+              <w:spacing w:after="0" w:line="240" w:lineRule="auto"/>
+            </w:pPr>
+            <w:r>
+              <w:rPr>
+                <w:sz w:val="24"/>
+              </w:rPr>
+              <w:t>84,1%</w:t>
+            </w:r>
+          </w:p>
+        </w:tc>
+        <w:tc>
+          <w:tcPr>
+            <w:tcW w:type="dxa" w:w="1701"/>
+          </w:tcPr>
+          <w:p>
+            <w:pPr>
+              <w:keepNext/>
+              <w:spacing w:after="0" w:line="240" w:lineRule="auto"/>
+            </w:pPr>
+            <w:r>
+              <w:rPr>
+                <w:sz w:val="24"/>
+              </w:rPr>
+              <w:t>58,1%</w:t>
+            </w:r>
+          </w:p>
+        </w:tc>
+        <w:tc>
+          <w:tcPr>
+            <w:tcW w:type="dxa" w:w="1701"/>
+          </w:tcPr>
+          <w:p>
+            <w:pPr>
+              <w:keepNext/>
+              <w:spacing w:after="0" w:line="240" w:lineRule="auto"/>
+            </w:pPr>
+            <w:r>
+              <w:rPr>
+                <w:sz w:val="24"/>
+              </w:rPr>
+              <w:t>35,9%</w:t>
+            </w:r>
+          </w:p>
+        </w:tc>
+        <w:tc>
+          <w:tcPr>
+            <w:tcW w:type="dxa" w:w="1701"/>
+          </w:tcPr>
+          <w:p>
+            <w:pPr>
+              <w:keepNext/>
+              <w:spacing w:after="0" w:line="240" w:lineRule="auto"/>
+            </w:pPr>
+            <w:r>
+              <w:rPr>
+                <w:sz w:val="24"/>
+              </w:rPr>
+              <w:t>455</w:t>
+            </w:r>
+          </w:p>
+        </w:tc>
+      </w:tr>
+      <w:tr>
+        <w:tc>
+          <w:tcPr>
+            <w:tcW w:type="dxa" w:w="1701"/>
+          </w:tcPr>
+          <w:p>
+            <w:pPr>
+              <w:keepNext/>
+              <w:spacing w:after="0" w:line="240" w:lineRule="auto"/>
+            </w:pPr>
+            <w:r>
+              <w:rPr>
+                <w:sz w:val="24"/>
+              </w:rPr>
+              <w:t>Bỏ suy luận thiếu import</w:t>
+            </w:r>
+          </w:p>
+        </w:tc>
+        <w:tc>
+          <w:tcPr>
+            <w:tcW w:type="dxa" w:w="1701"/>
+          </w:tcPr>
+          <w:p>
+            <w:pPr>
+              <w:keepNext/>
+              <w:spacing w:after="0" w:line="240" w:lineRule="auto"/>
+            </w:pPr>
+            <w:r>
+              <w:rPr>
+                <w:sz w:val="24"/>
+              </w:rPr>
+              <w:t>84,5%</w:t>
+            </w:r>
+          </w:p>
+        </w:tc>
+        <w:tc>
+          <w:tcPr>
+            <w:tcW w:type="dxa" w:w="1701"/>
+          </w:tcPr>
+          <w:p>
+            <w:pPr>
+              <w:keepNext/>
+              <w:spacing w:after="0" w:line="240" w:lineRule="auto"/>
+            </w:pPr>
+            <w:r>
+              <w:rPr>
+                <w:sz w:val="24"/>
+              </w:rPr>
+              <w:t>71,5%</w:t>
+            </w:r>
+          </w:p>
+        </w:tc>
+        <w:tc>
+          <w:tcPr>
+            <w:tcW w:type="dxa" w:w="1701"/>
+          </w:tcPr>
+          <w:p>
+            <w:pPr>
+              <w:keepNext/>
+              <w:spacing w:after="0" w:line="240" w:lineRule="auto"/>
+            </w:pPr>
+            <w:r>
+              <w:rPr>
+                <w:sz w:val="24"/>
+              </w:rPr>
+              <w:t>29,2%</w:t>
+            </w:r>
+          </w:p>
+        </w:tc>
+        <w:tc>
+          <w:tcPr>
+            <w:tcW w:type="dxa" w:w="1701"/>
+          </w:tcPr>
+          <w:p>
+            <w:pPr>
+              <w:keepNext/>
+              <w:spacing w:after="0" w:line="240" w:lineRule="auto"/>
+            </w:pPr>
+            <w:r>
+              <w:rPr>
+                <w:sz w:val="24"/>
+              </w:rPr>
+              <w:t>316</w:t>
+            </w:r>
+          </w:p>
+        </w:tc>
+      </w:tr>
+      <w:tr>
+        <w:tc>
+          <w:tcPr>
+            <w:tcW w:type="dxa" w:w="1701"/>
+          </w:tcPr>
+          <w:p>
+            <w:pPr>
+              <w:keepNext/>
+              <w:spacing w:after="0" w:line="240" w:lineRule="auto"/>
+            </w:pPr>
+            <w:r>
+              <w:rPr>
+                <w:sz w:val="24"/>
+              </w:rPr>
+              <w:t>Bỏ cả hai</w:t>
+            </w:r>
+          </w:p>
+        </w:tc>
+        <w:tc>
+          <w:tcPr>
+            <w:tcW w:type="dxa" w:w="1701"/>
+          </w:tcPr>
+          <w:p>
+            <w:pPr>
+              <w:keepNext/>
+              <w:spacing w:after="0" w:line="240" w:lineRule="auto"/>
+            </w:pPr>
+            <w:r>
+              <w:rPr>
+                <w:sz w:val="24"/>
+              </w:rPr>
+              <w:t>72,3%</w:t>
+            </w:r>
+          </w:p>
+        </w:tc>
+        <w:tc>
+          <w:tcPr>
+            <w:tcW w:type="dxa" w:w="1701"/>
+          </w:tcPr>
+          <w:p>
+            <w:pPr>
+              <w:keepNext/>
+              <w:spacing w:after="0" w:line="240" w:lineRule="auto"/>
+            </w:pPr>
+            <w:r>
+              <w:rPr>
+                <w:sz w:val="24"/>
+              </w:rPr>
+              <w:t>58,1%</w:t>
+            </w:r>
+          </w:p>
+        </w:tc>
+        <w:tc>
+          <w:tcPr>
+            <w:tcW w:type="dxa" w:w="1701"/>
+          </w:tcPr>
+          <w:p>
+            <w:pPr>
+              <w:keepNext/>
+              <w:spacing w:after="0" w:line="240" w:lineRule="auto"/>
+            </w:pPr>
+            <w:r>
+              <w:rPr>
+                <w:sz w:val="24"/>
+              </w:rPr>
+              <w:t>34,9%</w:t>
+            </w:r>
+          </w:p>
+        </w:tc>
+        <w:tc>
+          <w:tcPr>
+            <w:tcW w:type="dxa" w:w="1701"/>
+          </w:tcPr>
+          <w:p>
+            <w:pPr>
+              <w:keepNext/>
+              <w:spacing w:after="0" w:line="240" w:lineRule="auto"/>
+            </w:pPr>
+            <w:r>
+              <w:rPr>
+                <w:sz w:val="24"/>
+              </w:rPr>
+              <w:t>455</w:t>
+            </w:r>
+          </w:p>
+        </w:tc>
+      </w:tr>
+      <w:tr>
+        <w:tc>
+          <w:tcPr>
+            <w:tcW w:type="dxa" w:w="1701"/>
+          </w:tcPr>
+          <w:p>
+            <w:pPr>
+              <w:keepNext w:val="0"/>
+              <w:spacing w:after="0" w:line="240" w:lineRule="auto"/>
+            </w:pPr>
+            <w:r>
+              <w:rPr>
+                <w:sz w:val="24"/>
+              </w:rPr>
+              <w:t>Không phân loại, mọi mẫu sang LLM</w:t>
+            </w:r>
+          </w:p>
+        </w:tc>
+        <w:tc>
+          <w:tcPr>
+            <w:tcW w:type="dxa" w:w="1701"/>
+          </w:tcPr>
+          <w:p>
+            <w:pPr>
+              <w:keepNext w:val="0"/>
+              <w:spacing w:after="0" w:line="240" w:lineRule="auto"/>
+            </w:pPr>
+          </w:p>
+        </w:tc>
+        <w:tc>
+          <w:tcPr>
+            <w:tcW w:type="dxa" w:w="1701"/>
+          </w:tcPr>
+          <w:p>
+            <w:pPr>
+              <w:keepNext w:val="0"/>
+              <w:spacing w:after="0" w:line="240" w:lineRule="auto"/>
+            </w:pPr>
+            <w:r>
+              <w:rPr>
+                <w:sz w:val="24"/>
+              </w:rPr>
+              <w:t>0%</w:t>
+            </w:r>
+          </w:p>
+        </w:tc>
+        <w:tc>
+          <w:tcPr>
+            <w:tcW w:type="dxa" w:w="1701"/>
+          </w:tcPr>
+          <w:p>
+            <w:pPr>
+              <w:keepNext w:val="0"/>
+              <w:spacing w:after="0" w:line="240" w:lineRule="auto"/>
+            </w:pPr>
+            <w:r>
+              <w:rPr>
+                <w:sz w:val="24"/>
+              </w:rPr>
+              <w:t>53,9%</w:t>
+            </w:r>
+          </w:p>
+        </w:tc>
+        <w:tc>
+          <w:tcPr>
+            <w:tcW w:type="dxa" w:w="1701"/>
+          </w:tcPr>
+          <w:p>
+            <w:pPr>
+              <w:keepNext w:val="0"/>
+              <w:spacing w:after="0" w:line="240" w:lineRule="auto"/>
+            </w:pPr>
+            <w:r>
+              <w:rPr>
+                <w:sz w:val="24"/>
+              </w:rPr>
+              <w:t>924</w:t>
+            </w:r>
+          </w:p>
+        </w:tc>
+      </w:tr>
+    </w:tbl>
+    <w:p>
+      <w:pPr>
+        <w:spacing w:after="0"/>
+      </w:pPr>
+    </w:p>
+    <w:p>
+      <w:pPr>
+        <w:ind w:firstLine="567"/>
+        <w:jc w:val="both"/>
+      </w:pPr>
+      <w:r>
+        <w:t>Bảng 7.3 phát lại ba lần chạy lai k=1 với các bộ phân loại yếu hơn mà không gọi thêm LLM. Mẫu được gửi sang LLM nhận kết quả của lần chạy LLM k=1 ghép cặp, mẫu nhận ứng viên luật mới được kiểm chứng lại bằng Lean. Với bộ phân loại đầy đủ, bản phát lại khớp 100% lần thử đầu đã ghi. Lọc lỗi hệ quả và suy luận thiếu import nâng độ khớp nhãn từ 72,3% lên 96,3%. Tuy vậy, nhãn đúng hơn đưa nhiều mẫu hơn sang các luật R1 đến R6 vốn kém chính xác, nên thành công của lai k=1 giảm từ 34,9% xuống 30,3% trong khi token giảm 31%. Riêng suy luận thiếu import có lợi rõ, thêm 1,1 điểm, vì nó gửi đúng mẫu tới R0. Bộ phân loại chính xác là điều kiện cần, còn nút thắt nằm ở độ chính xác của luật.</w:t>
+      </w:r>
+    </w:p>
+    <w:p>
+      <w:pPr>
         <w:pStyle w:val="Heading2"/>
       </w:pPr>
       <w:r>
@@ -6765,7 +7329,7 @@
         <w:pStyle w:val="ListBullet"/>
       </w:pPr>
       <w:r>
-        <w:t>Luật R0, R5, R6, R7 được thiết kế từ lỗi quan sát trên tập 50 mẫu cũ và seed thử nghiệm, không từ hold-out.</w:t>
+        <w:t>Luật R0, R5, R6, R7 và bảng đổi tên của R5 được thiết kế từ lỗi quan sát trên tập 50 mẫu cũ và seed thử nghiệm trước khi chia hold-out, nên có nguy cơ rò rỉ. R5 đạt 0% trên hold-out nên rò rỉ không làm đẹp kết quả. R0 và R7 sửa đúng loại lỗi mà toán tử tổng hợp sinh ra, nên độ chính xác gần tuyệt đối của chúng phản ánh độ khớp với bộ sinh lỗi nhiều hơn là với lỗi thật.</w:t>
       </w:r>
     </w:p>
     <w:p>
@@ -6930,41 +7494,7 @@
         <w:ind w:left="567" w:hanging="567"/>
       </w:pPr>
       <w:r>
-        <w:t xml:space="preserve">[8] Z. Z. Ren et al., </w:t>
-      </w:r>
-      <w:r>
-        <w:rPr>
-          <w:i/>
-        </w:rPr>
-        <w:t>DeepSeek-Prover-V2: Advancing Formal Mathematical Reasoning via Reinforcement Learning for Subgoal Decomposition</w:t>
-      </w:r>
-      <w:r>
-        <w:t>, arXiv:2504.21801, 2025.</w:t>
-      </w:r>
-    </w:p>
-    <w:p>
-      <w:pPr>
-        <w:ind w:left="567" w:hanging="567"/>
-      </w:pPr>
-      <w:r>
-        <w:t xml:space="preserve">[9] A. Q. Jiang et al., </w:t>
-      </w:r>
-      <w:r>
-        <w:rPr>
-          <w:i/>
-        </w:rPr>
-        <w:t>Draft, Sketch, and Prove: Guiding Formal Theorem Provers with Informal Proofs</w:t>
-      </w:r>
-      <w:r>
-        <w:t>, ICLR, 2023.</w:t>
-      </w:r>
-    </w:p>
-    <w:p>
-      <w:pPr>
-        <w:ind w:left="567" w:hanging="567"/>
-      </w:pPr>
-      <w:r>
-        <w:t xml:space="preserve">[10] J. Leskovec, A. Rajaraman, J. D. Ullman, </w:t>
+        <w:t xml:space="preserve">[8] J. Leskovec, A. Rajaraman, J. D. Ullman, </w:t>
       </w:r>
       <w:r>
         <w:rPr>

</xml_diff>

<commit_message>
docs(report): sync with the gateway, Docker check and queue integration
- appendix: 121 tests (was 96); delivery paragraph on repair_batch.py
  (Group 5 contract v0.1 -> feedback + repaired-v1 for Groups 7/8) and
  the Docker image check (121 tests and identical gateway run in the
  container)
- conclusion: audit numbers stated as in 7.1 (among failed samples,
  17-26% changed statement, 10-24% sorry or forbidden constructs)
- future work: Redis FIFO/priority queue prototype exists but is only
  tested with the simulated verifier
- still 20 pages

Co-Authored-By: Claude Opus 5.5 <noreply@anthropic.com>
</commit_message>
<xml_diff>
--- a/reports/report.docx
+++ b/reports/report.docx
@@ -7348,7 +7348,7 @@
         <w:jc w:val="both"/>
       </w:pPr>
       <w:r>
-        <w:t>Với RQ1, tiêm chẩn đoán có cấu trúc của Lean tăng tỷ lệ sửa thành công đã kiểm toán từ 31,7% lên 53,9% và giảm 45% chi phí so với thử lại nguyên prompt. Với RQ2, ba lần thử với LLM có chẩn đoán đạt 65,1% ở 2,45 USD cho 1.000 mẫu, là điểm chất lượng cao nhất trên biên Pareto; chiến lược lai chỉ có lợi về chi phí và bị kéo xuống bởi các luật có độ chính xác thấp. Với RQ3, nút thắt đầu tiên là khởi động nguội Mathlib, được giải bằng REPL thường trú nhanh hơn ba đến bốn bậc độ lớn; nút thắt thứ hai là CPU, khiến thông lượng bão hoà từ khoảng 2 worker trên 4 vCPU. Kiểm toán ngữ nghĩa là bắt buộc vì 17% đến 26% bản sửa của LLM đổi đề hoặc lách bằng sorry.</w:t>
+        <w:t>Với RQ1, tiêm chẩn đoán có cấu trúc của Lean tăng tỷ lệ sửa thành công đã kiểm toán từ 31,7% lên 53,9% và giảm 45% chi phí so với thử lại nguyên prompt. Với RQ2, ba lần thử với LLM có chẩn đoán đạt 65,1% ở 2,45 USD cho 1.000 mẫu, là điểm chất lượng cao nhất trên biên Pareto; chiến lược lai chỉ có lợi về chi phí và bị kéo xuống bởi các luật có độ chính xác thấp. Với RQ3, nút thắt đầu tiên là khởi động nguội Mathlib, được giải bằng REPL thường trú nhanh hơn ba đến bốn bậc độ lớn; nút thắt thứ hai là CPU, khiến thông lượng bão hoà từ khoảng 2 worker trên 4 vCPU. Kiểm toán ngữ nghĩa là bắt buộc: trong các mẫu thất bại, 17% đến 26% bản sửa cuối của LLM đổi đề và 10% đến 24% lách bằng sorry hoặc cấu trúc cấm.</w:t>
       </w:r>
     </w:p>
     <w:p>
@@ -7357,7 +7357,7 @@
         <w:jc w:val="both"/>
       </w:pPr>
       <w:r>
-        <w:t>Hướng phát triển gồm: router chọn luật theo độ chính xác đo trên tập train; hàng đợi ưu tiên cho lỗi rẻ và luật chính xác; phân tán worker qua nhiều máy vì một máy bão hoà CPU sớm; kiểm toán bằng so sánh kiểu đã elaborate thay cho so sánh văn bản; dùng dữ liệu thật của Nhóm 5 và mô hình chuyên Lean mã nguồn mở chạy trên GPU.</w:t>
+        <w:t>Hướng phát triển gồm: router chọn luật theo độ chính xác đo trên tập train; hàng đợi ưu tiên cho lỗi rẻ và luật chính xác, dựa trên nguyên mẫu hàng đợi Redis FIFO và ưu tiên đã có trong mã nhưng mới kiểm thử với bộ kiểm chứng giả lập; phân tán worker qua nhiều máy vì một máy bão hoà CPU sớm; kiểm toán bằng so sánh kiểu đã elaborate thay cho so sánh văn bản; dùng dữ liệu thật của Nhóm 5 và mô hình chuyên Lean mã nguồn mở chạy trên GPU.</w:t>
       </w:r>
     </w:p>
     <w:p>
@@ -7522,7 +7522,7 @@
         <w:jc w:val="both"/>
       </w:pPr>
       <w:r>
-        <w:t>Nhóm sử dụng trợ lý AI Claude của Anthropic để hỗ trợ viết mã, thiết kế thực nghiệm, phân tích và soạn tài liệu. Gemini 3.5 Flash-Lite và 3.6 Flash là đối tượng nghiên cứu, không tham gia viết báo cáo. Mọi mã có AI hỗ trợ đều qua 96 kiểm thử tự động và chạy Lean thật, mọi số liệu truy được tới run record trong thư mục results/raw. Nhật ký sử dụng AI nằm ở docs/ai_use_log.jsonl và docs/ai_use_statement.md; phân vai, đóng góp đối chiếu lịch sử Git và phần bảo vệ của từng thành viên nằm ở contributions.md. Toàn bộ kết quả tái lập được bằng các lệnh trong README: cài đặt bằng scripts/kaggle_setup.sh, sinh dữ liệu bằng scripts/build_seeds.py và scripts/generate_error_dataset.py, chạy thực nghiệm bằng các notebook trong notebooks/sessions, và sinh hình bằng scripts/generate_figures.py.</w:t>
+        <w:t>Nhóm sử dụng trợ lý AI Claude của Anthropic để hỗ trợ viết mã, thiết kế thực nghiệm, phân tích và soạn tài liệu. Gemini 3.5 Flash-Lite và 3.6 Flash là đối tượng nghiên cứu, không tham gia viết báo cáo. Mọi mã có AI hỗ trợ đều qua 121 kiểm thử tự động và chạy Lean thật, mọi số liệu truy được tới run record trong thư mục results/raw. Nhật ký sử dụng AI nằm ở docs/ai_use_log.jsonl và docs/ai_use_statement.md; phân vai, đóng góp đối chiếu lịch sử Git và phần bảo vệ của từng thành viên nằm ở contributions.md. Toàn bộ kết quả tái lập được bằng các lệnh trong README: cài đặt bằng scripts/kaggle_setup.sh, sinh dữ liệu bằng scripts/build_seeds.py và scripts/generate_error_dataset.py, chạy thực nghiệm bằng các notebook trong notebooks/sessions, và sinh hình bằng scripts/generate_figures.py. Về bàn giao, scripts/repair_batch.py nhận tệp của Nhóm 5 theo hợp đồng dữ liệu v0.1, kiểm tra trường bắt buộc, checksum và bản trùng, kiểm chứng lại từng ứng viên rồi trả feedback_group5.jsonl cho Nhóm 5 và đầu ra repaired-v1 cho Nhóm 7, Nhóm 8. Image Docker đã được build thử; trong container, 121 kiểm thử đều qua và cổng nhận cho kết quả giống hệt khi chạy trên máy.</w:t>
       </w:r>
     </w:p>
     <w:sectPr>

</xml_diff>